<commit_message>
Deploying to gh-pages from @ Morrison-Lab/rme@b43cfdc22af9112d92e49b673310ad1192abcfc6 🚀
</commit_message>
<xml_diff>
--- a/chapters/appendices-are-prereqs-handout.docx
+++ b/chapters/appendices-are-prereqs-handout.docx
@@ -102,6 +102,154 @@
         <w:t xml:space="preserve">of the assumed prerequisites.</w:t>
       </w:r>
     </w:p>
+    <w:bookmarkStart w:id="12" w:name="sec-prereq-notes"/>
+    <w:p>
+      <w:pPr>
+        <w:pStyle w:val="Heading1"/>
+      </w:pPr>
+      <w:r>
+        <w:t xml:space="preserve">1. Prerequisite notes</w:t>
+      </w:r>
+    </w:p>
+    <w:p>
+      <w:pPr>
+        <w:pStyle w:val="FirstParagraph"/>
+      </w:pPr>
+      <w:r>
+        <w:t xml:space="preserve">Most of the prerequisite material now lives in three companion sets of notes,</w:t>
+      </w:r>
+      <w:r>
+        <w:t xml:space="preserve"> </w:t>
+      </w:r>
+      <w:r>
+        <w:t xml:space="preserve">which other courses share:</w:t>
+      </w:r>
+    </w:p>
+    <w:p>
+      <w:pPr>
+        <w:pStyle w:val="Compact"/>
+        <w:numPr>
+          <w:ilvl w:val="0"/>
+          <w:numId w:val="1001"/>
+        </w:numPr>
+      </w:pPr>
+      <w:hyperlink r:id="rId9">
+        <w:r>
+          <w:rPr>
+            <w:rStyle w:val="Hyperlink"/>
+          </w:rPr>
+          <w:t xml:space="preserve">Mathematics for Data Science</w:t>
+        </w:r>
+      </w:hyperlink>
+      <w:r>
+        <w:t xml:space="preserve"> </w:t>
+      </w:r>
+      <w:r>
+        <w:t xml:space="preserve">(mds):</w:t>
+      </w:r>
+      <w:r>
+        <w:t xml:space="preserve"> </w:t>
+      </w:r>
+      <w:r>
+        <w:t xml:space="preserve">notation, algebra, calculus, linear algebra, vector calculus, and proof writing;</w:t>
+      </w:r>
+    </w:p>
+    <w:p>
+      <w:pPr>
+        <w:pStyle w:val="Compact"/>
+        <w:numPr>
+          <w:ilvl w:val="0"/>
+          <w:numId w:val="1001"/>
+        </w:numPr>
+      </w:pPr>
+      <w:hyperlink r:id="rId10">
+        <w:r>
+          <w:rPr>
+            <w:rStyle w:val="Hyperlink"/>
+          </w:rPr>
+          <w:t xml:space="preserve">Probability for Data Science</w:t>
+        </w:r>
+      </w:hyperlink>
+      <w:r>
+        <w:t xml:space="preserve"> </w:t>
+      </w:r>
+      <w:r>
+        <w:t xml:space="preserve">(pds):</w:t>
+      </w:r>
+      <w:r>
+        <w:t xml:space="preserve"> </w:t>
+      </w:r>
+      <w:r>
+        <w:t xml:space="preserve">probability, random variables, expectation, variance,</w:t>
+      </w:r>
+      <w:r>
+        <w:t xml:space="preserve"> </w:t>
+      </w:r>
+      <w:r>
+        <w:t xml:space="preserve">probability distributions (including the Bernoulli, Poisson, and negative binomial),</w:t>
+      </w:r>
+      <w:r>
+        <w:t xml:space="preserve"> </w:t>
+      </w:r>
+      <w:r>
+        <w:t xml:space="preserve">and the central limit theorem;</w:t>
+      </w:r>
+    </w:p>
+    <w:p>
+      <w:pPr>
+        <w:pStyle w:val="Compact"/>
+        <w:numPr>
+          <w:ilvl w:val="0"/>
+          <w:numId w:val="1001"/>
+        </w:numPr>
+      </w:pPr>
+      <w:hyperlink r:id="rId11">
+        <w:r>
+          <w:rPr>
+            <w:rStyle w:val="Hyperlink"/>
+          </w:rPr>
+          <w:t xml:space="preserve">Statistics for Data Science</w:t>
+        </w:r>
+      </w:hyperlink>
+      <w:r>
+        <w:t xml:space="preserve"> </w:t>
+      </w:r>
+      <w:r>
+        <w:t xml:space="preserve">(sds):</w:t>
+      </w:r>
+      <w:r>
+        <w:t xml:space="preserve"> </w:t>
+      </w:r>
+      <w:r>
+        <w:t xml:space="preserve">types of data, exploratory data analysis, estimation, statistical inference,</w:t>
+      </w:r>
+      <w:r>
+        <w:t xml:space="preserve"> </w:t>
+      </w:r>
+      <w:r>
+        <w:t xml:space="preserve">maximum likelihood, basic statistical methods, nonparametric models,</w:t>
+      </w:r>
+      <w:r>
+        <w:t xml:space="preserve"> </w:t>
+      </w:r>
+      <w:r>
+        <w:t xml:space="preserve">and Bayesian inference.</w:t>
+      </w:r>
+    </w:p>
+    <w:p>
+      <w:pPr>
+        <w:pStyle w:val="FirstParagraph"/>
+      </w:pPr>
+      <w:r>
+        <w:t xml:space="preserve">These pages replace the appendices that this book used to carry on those topics;</w:t>
+      </w:r>
+      <w:r>
+        <w:t xml:space="preserve"> </w:t>
+      </w:r>
+      <w:r>
+        <w:t xml:space="preserve">links elsewhere in these notes point to them directly.</w:t>
+      </w:r>
+    </w:p>
     <w:p>
       <w:r>
         <w:pict>
@@ -193,13 +341,14 @@
         </w:pict>
       </w:r>
     </w:p>
-    <w:bookmarkStart w:id="9" w:name="rote-memorization-is-sometimes-necessary"/>
+    <w:bookmarkEnd w:id="12"/>
+    <w:bookmarkStart w:id="13" w:name="rote-memorization-is-sometimes-necessary"/>
     <w:p>
       <w:pPr>
         <w:pStyle w:val="Heading1"/>
       </w:pPr>
       <w:r>
-        <w:t xml:space="preserve">1. Rote memorization is sometimes necessary</w:t>
+        <w:t xml:space="preserve">2. Rote memorization is sometimes necessary</w:t>
       </w:r>
     </w:p>
     <w:p>
@@ -306,7 +455,7 @@
         <w:t xml:space="preserve">You will need them.</w:t>
       </w:r>
     </w:p>
-    <w:bookmarkEnd w:id="9"/>
+    <w:bookmarkEnd w:id="13"/>
     <w:sectPr>
       <w:footnotePr>
         <w:numRestart w:val="eachSect"/>
@@ -417,8 +566,114 @@
       </w:pPr>
     </w:lvl>
   </w:abstractNum>
+  <w:abstractNum w:abstractNumId="991">
+    <w:nsid w:val="0000A991"/>
+    <w:multiLevelType w:val="multilevel"/>
+    <w:lvl w:ilvl="0">
+      <w:numFmt w:val="bullet"/>
+      <w:lvlText w:val=""/>
+      <w:lvlJc w:val="left"/>
+      <w:pPr>
+        <w:ind w:left="720" w:hanging="360"/>
+      </w:pPr>
+      <w:rPr>
+        <w:rFonts w:ascii="Symbol" w:hAnsi="Symbol" w:cs="Symbol" w:hint="default"/>
+      </w:rPr>
+    </w:lvl>
+    <w:lvl w:ilvl="1">
+      <w:numFmt w:val="bullet"/>
+      <w:lvlText w:val="o"/>
+      <w:lvlJc w:val="left"/>
+      <w:pPr>
+        <w:ind w:left="1440" w:hanging="360"/>
+      </w:pPr>
+      <w:rPr>
+        <w:rFonts w:ascii="Courier New" w:hAnsi="Courier New" w:cs="Courier New" w:hint="default"/>
+      </w:rPr>
+    </w:lvl>
+    <w:lvl w:ilvl="2">
+      <w:numFmt w:val="bullet"/>
+      <w:lvlText w:val=""/>
+      <w:lvlJc w:val="left"/>
+      <w:pPr>
+        <w:ind w:left="2160" w:hanging="360"/>
+      </w:pPr>
+      <w:rPr>
+        <w:rFonts w:ascii="Wingdings" w:hAnsi="Wingdings" w:cs="Wingdings" w:hint="default"/>
+      </w:rPr>
+    </w:lvl>
+    <w:lvl w:ilvl="3">
+      <w:numFmt w:val="bullet"/>
+      <w:lvlText w:val=""/>
+      <w:lvlJc w:val="left"/>
+      <w:pPr>
+        <w:ind w:left="2880" w:hanging="360"/>
+      </w:pPr>
+      <w:rPr>
+        <w:rFonts w:ascii="Symbol" w:hAnsi="Symbol" w:cs="Symbol" w:hint="default"/>
+      </w:rPr>
+    </w:lvl>
+    <w:lvl w:ilvl="4">
+      <w:numFmt w:val="bullet"/>
+      <w:lvlText w:val="o"/>
+      <w:lvlJc w:val="left"/>
+      <w:pPr>
+        <w:ind w:left="3600" w:hanging="360"/>
+      </w:pPr>
+      <w:rPr>
+        <w:rFonts w:ascii="Courier New" w:hAnsi="Courier New" w:cs="Courier New" w:hint="default"/>
+      </w:rPr>
+    </w:lvl>
+    <w:lvl w:ilvl="5">
+      <w:numFmt w:val="bullet"/>
+      <w:lvlText w:val=""/>
+      <w:lvlJc w:val="left"/>
+      <w:pPr>
+        <w:ind w:left="4320" w:hanging="360"/>
+      </w:pPr>
+      <w:rPr>
+        <w:rFonts w:ascii="Wingdings" w:hAnsi="Wingdings" w:cs="Wingdings" w:hint="default"/>
+      </w:rPr>
+    </w:lvl>
+    <w:lvl w:ilvl="6">
+      <w:numFmt w:val="bullet"/>
+      <w:lvlText w:val=""/>
+      <w:lvlJc w:val="left"/>
+      <w:pPr>
+        <w:ind w:left="5040" w:hanging="360"/>
+      </w:pPr>
+      <w:rPr>
+        <w:rFonts w:ascii="Symbol" w:hAnsi="Symbol" w:cs="Symbol" w:hint="default"/>
+      </w:rPr>
+    </w:lvl>
+    <w:lvl w:ilvl="7">
+      <w:numFmt w:val="bullet"/>
+      <w:lvlText w:val="o"/>
+      <w:lvlJc w:val="left"/>
+      <w:pPr>
+        <w:ind w:left="5760" w:hanging="360"/>
+      </w:pPr>
+      <w:rPr>
+        <w:rFonts w:ascii="Courier New" w:hAnsi="Courier New" w:cs="Courier New" w:hint="default"/>
+      </w:rPr>
+    </w:lvl>
+    <w:lvl w:ilvl="8">
+      <w:numFmt w:val="bullet"/>
+      <w:lvlText w:val=""/>
+      <w:lvlJc w:val="left"/>
+      <w:pPr>
+        <w:ind w:left="6480" w:hanging="360"/>
+      </w:pPr>
+      <w:rPr>
+        <w:rFonts w:ascii="Wingdings" w:hAnsi="Wingdings" w:cs="Wingdings" w:hint="default"/>
+      </w:rPr>
+    </w:lvl>
+  </w:abstractNum>
   <w:num w:numId="1000">
     <w:abstractNumId w:val="990"/>
+  </w:num>
+  <w:num w:numId="1001">
+    <w:abstractNumId w:val="991"/>
   </w:num>
 </w:numbering>
 </file>

</xml_diff>